<commit_message>
Update run of show host assignments
</commit_message>
<xml_diff>
--- a/public/SIX-2026-Run-of-Show.docx
+++ b/public/SIX-2026-Run-of-Show.docx
@@ -39,7 +39,7 @@
           <w:rFonts w:ascii="Arial" w:hAnsi="Arial"/>
           <w:sz w:val="16"/>
         </w:rPr>
-        <w:t>Host A = Stephazoid   |   Host B = AbdallahSmash   |   Host C = MacnCheesep1z   |   Host D = Rockagoth   |   Host E = AlchemistJoker</w:t>
+        <w:t>Host A = Unavailable   |   Host B = AbdallahSmash   |   Host C = MacnCheesep1z   |   Host D = Rockagoth   |   Host E = AlchemistJoker</w:t>
       </w:r>
     </w:p>
     <w:tbl>
@@ -542,7 +542,7 @@
                 <w:color w:val="202028"/>
                 <w:sz w:val="14"/>
               </w:rPr>
-              <w:t>Stephazoid</w:t>
+              <w:t>MacnCheesep1z</w:t>
             </w:r>
           </w:p>
         </w:tc>
@@ -2133,7 +2133,7 @@
                 <w:color w:val="202028"/>
                 <w:sz w:val="14"/>
               </w:rPr>
-              <w:t>Stephazoid</w:t>
+              <w:t>AbdallahSmash</w:t>
             </w:r>
           </w:p>
         </w:tc>
@@ -2289,7 +2289,7 @@
                 <w:color w:val="202028"/>
                 <w:sz w:val="14"/>
               </w:rPr>
-              <w:t>Stephazoid</w:t>
+              <w:t>Rockagoth</w:t>
             </w:r>
           </w:p>
         </w:tc>
@@ -4036,7 +4036,7 @@
                 <w:color w:val="202028"/>
                 <w:sz w:val="14"/>
               </w:rPr>
-              <w:t>Stephazoid</w:t>
+              <w:t>AlchemistJoker</w:t>
             </w:r>
           </w:p>
         </w:tc>
@@ -5783,7 +5783,7 @@
                 <w:color w:val="202028"/>
                 <w:sz w:val="14"/>
               </w:rPr>
-              <w:t>Stephazoid</w:t>
+              <w:t>AbdallahSmash</w:t>
             </w:r>
           </w:p>
         </w:tc>
@@ -7530,7 +7530,7 @@
                 <w:color w:val="202028"/>
                 <w:sz w:val="14"/>
               </w:rPr>
-              <w:t>Stephazoid</w:t>
+              <w:t>AlchemistJoker</w:t>
             </w:r>
           </w:p>
         </w:tc>
@@ -8960,7 +8960,7 @@
                 <w:color w:val="202028"/>
                 <w:sz w:val="14"/>
               </w:rPr>
-              <w:t>Stephazoid</w:t>
+              <w:t>Rockagoth</w:t>
             </w:r>
           </w:p>
         </w:tc>
@@ -10234,7 +10234,7 @@
                 <w:color w:val="202028"/>
                 <w:sz w:val="14"/>
               </w:rPr>
-              <w:t>AlchemistJoker</w:t>
+              <w:t>AbdallahSmash</w:t>
             </w:r>
           </w:p>
         </w:tc>
@@ -10390,7 +10390,7 @@
                 <w:color w:val="202028"/>
                 <w:sz w:val="14"/>
               </w:rPr>
-              <w:t>Stephazoid</w:t>
+              <w:t>MacnCheesep1z</w:t>
             </w:r>
           </w:p>
         </w:tc>
@@ -11981,7 +11981,7 @@
                 <w:color w:val="202028"/>
                 <w:sz w:val="14"/>
               </w:rPr>
-              <w:t>Stephazoid</w:t>
+              <w:t>MacnCheesep1z</w:t>
             </w:r>
           </w:p>
         </w:tc>
@@ -13088,7 +13088,7 @@
                 <w:color w:val="202028"/>
                 <w:sz w:val="14"/>
               </w:rPr>
-              <w:t>Stephazoid</w:t>
+              <w:t>AlchemistJoker</w:t>
             </w:r>
           </w:p>
         </w:tc>

</xml_diff>

<commit_message>
Remove The Assessment from run of show
</commit_message>
<xml_diff>
--- a/public/SIX-2026-Run-of-Show.docx
+++ b/public/SIX-2026-Run-of-Show.docx
@@ -14054,161 +14054,6 @@
             <w:tcW w:type="dxa" w:w="6854"/>
             <w:vAlign w:val="center"/>
             <w:shd w:fill="F2F1F5"/>
-          </w:tcPr>
-          <w:p>
-            <w:pPr>
-              <w:spacing w:after="0"/>
-            </w:pPr>
-            <w:r/>
-            <w:r>
-              <w:rPr>
-                <w:rFonts w:ascii="Arial" w:hAnsi="Arial"/>
-                <w:b w:val="0"/>
-                <w:i w:val="0"/>
-                <w:color w:val="202028"/>
-                <w:sz w:val="14"/>
-              </w:rPr>
-            </w:r>
-          </w:p>
-        </w:tc>
-      </w:tr>
-      <w:tr>
-        <w:tc>
-          <w:tcPr>
-            <w:tcW w:type="dxa" w:w="547"/>
-            <w:vAlign w:val="center"/>
-          </w:tcPr>
-          <w:p>
-            <w:pPr>
-              <w:spacing w:after="0"/>
-            </w:pPr>
-            <w:r/>
-            <w:r>
-              <w:rPr>
-                <w:rFonts w:ascii="Arial" w:hAnsi="Arial"/>
-                <w:b w:val="0"/>
-                <w:i w:val="0"/>
-                <w:color w:val="202028"/>
-                <w:sz w:val="14"/>
-              </w:rPr>
-              <w:t>40</w:t>
-            </w:r>
-          </w:p>
-        </w:tc>
-        <w:tc>
-          <w:tcPr>
-            <w:tcW w:type="dxa" w:w="2477"/>
-            <w:vAlign w:val="center"/>
-          </w:tcPr>
-          <w:p>
-            <w:pPr>
-              <w:spacing w:after="0"/>
-            </w:pPr>
-            <w:r/>
-            <w:r>
-              <w:rPr>
-                <w:rFonts w:ascii="Arial" w:hAnsi="Arial"/>
-                <w:b/>
-                <w:i w:val="0"/>
-                <w:color w:val="7445C7"/>
-                <w:sz w:val="14"/>
-              </w:rPr>
-              <w:t>The Assessment</w:t>
-            </w:r>
-          </w:p>
-        </w:tc>
-        <w:tc>
-          <w:tcPr>
-            <w:tcW w:type="dxa" w:w="2088"/>
-            <w:vAlign w:val="center"/>
-          </w:tcPr>
-          <w:p>
-            <w:pPr>
-              <w:spacing w:after="0"/>
-            </w:pPr>
-            <w:r/>
-            <w:r>
-              <w:rPr>
-                <w:rFonts w:ascii="Arial" w:hAnsi="Arial"/>
-                <w:b w:val="0"/>
-                <w:i w:val="0"/>
-                <w:color w:val="202028"/>
-                <w:sz w:val="14"/>
-              </w:rPr>
-              <w:t>Miga Games · Booth U11</w:t>
-            </w:r>
-          </w:p>
-        </w:tc>
-        <w:tc>
-          <w:tcPr>
-            <w:tcW w:type="dxa" w:w="1008"/>
-            <w:vAlign w:val="center"/>
-          </w:tcPr>
-          <w:p>
-            <w:pPr>
-              <w:spacing w:after="0"/>
-            </w:pPr>
-            <w:r/>
-            <w:r>
-              <w:rPr>
-                <w:rFonts w:ascii="Arial" w:hAnsi="Arial"/>
-                <w:b w:val="0"/>
-                <w:i w:val="0"/>
-                <w:color w:val="202028"/>
-                <w:sz w:val="14"/>
-              </w:rPr>
-              <w:t>5:42 PM</w:t>
-            </w:r>
-          </w:p>
-        </w:tc>
-        <w:tc>
-          <w:tcPr>
-            <w:tcW w:type="dxa" w:w="1008"/>
-            <w:vAlign w:val="center"/>
-          </w:tcPr>
-          <w:p>
-            <w:pPr>
-              <w:spacing w:after="0"/>
-            </w:pPr>
-            <w:r/>
-            <w:r>
-              <w:rPr>
-                <w:rFonts w:ascii="Arial" w:hAnsi="Arial"/>
-                <w:b w:val="0"/>
-                <w:i w:val="0"/>
-                <w:color w:val="202028"/>
-                <w:sz w:val="14"/>
-              </w:rPr>
-              <w:t>5:48 PM</w:t>
-            </w:r>
-          </w:p>
-        </w:tc>
-        <w:tc>
-          <w:tcPr>
-            <w:tcW w:type="dxa" w:w="893"/>
-            <w:vAlign w:val="center"/>
-          </w:tcPr>
-          <w:p>
-            <w:pPr>
-              <w:spacing w:after="0"/>
-            </w:pPr>
-            <w:r/>
-            <w:r>
-              <w:rPr>
-                <w:rFonts w:ascii="Arial" w:hAnsi="Arial"/>
-                <w:b w:val="0"/>
-                <w:i w:val="0"/>
-                <w:color w:val="202028"/>
-                <w:sz w:val="14"/>
-              </w:rPr>
-              <w:t>Rockagoth</w:t>
-            </w:r>
-          </w:p>
-        </w:tc>
-        <w:tc>
-          <w:tcPr>
-            <w:tcW w:type="dxa" w:w="6854"/>
-            <w:vAlign w:val="center"/>
           </w:tcPr>
           <w:p>
             <w:pPr>

</xml_diff>

<commit_message>
Remove redundant run of show break
</commit_message>
<xml_diff>
--- a/public/SIX-2026-Run-of-Show.docx
+++ b/public/SIX-2026-Run-of-Show.docx
@@ -14023,168 +14023,6 @@
                 <w:sz w:val="14"/>
               </w:rPr>
               <w:t>5:42 PM</w:t>
-            </w:r>
-          </w:p>
-        </w:tc>
-        <w:tc>
-          <w:tcPr>
-            <w:tcW w:type="dxa" w:w="893"/>
-            <w:vAlign w:val="center"/>
-            <w:shd w:fill="F2F1F5"/>
-          </w:tcPr>
-          <w:p>
-            <w:pPr>
-              <w:spacing w:after="0"/>
-            </w:pPr>
-            <w:r/>
-            <w:r>
-              <w:rPr>
-                <w:rFonts w:ascii="Arial" w:hAnsi="Arial"/>
-                <w:b w:val="0"/>
-                <w:i w:val="0"/>
-                <w:color w:val="202028"/>
-                <w:sz w:val="14"/>
-              </w:rPr>
-              <w:t>-</w:t>
-            </w:r>
-          </w:p>
-        </w:tc>
-        <w:tc>
-          <w:tcPr>
-            <w:tcW w:type="dxa" w:w="6854"/>
-            <w:vAlign w:val="center"/>
-            <w:shd w:fill="F2F1F5"/>
-          </w:tcPr>
-          <w:p>
-            <w:pPr>
-              <w:spacing w:after="0"/>
-            </w:pPr>
-            <w:r/>
-            <w:r>
-              <w:rPr>
-                <w:rFonts w:ascii="Arial" w:hAnsi="Arial"/>
-                <w:b w:val="0"/>
-                <w:i w:val="0"/>
-                <w:color w:val="202028"/>
-                <w:sz w:val="14"/>
-              </w:rPr>
-            </w:r>
-          </w:p>
-        </w:tc>
-      </w:tr>
-      <w:tr>
-        <w:tc>
-          <w:tcPr>
-            <w:tcW w:type="dxa" w:w="547"/>
-            <w:vAlign w:val="center"/>
-            <w:shd w:fill="F2F1F5"/>
-          </w:tcPr>
-          <w:p>
-            <w:pPr>
-              <w:spacing w:after="0"/>
-            </w:pPr>
-            <w:r/>
-            <w:r>
-              <w:rPr>
-                <w:rFonts w:ascii="Arial" w:hAnsi="Arial"/>
-                <w:b w:val="0"/>
-                <w:i w:val="0"/>
-                <w:color w:val="202028"/>
-                <w:sz w:val="14"/>
-              </w:rPr>
-              <w:t>-</w:t>
-            </w:r>
-          </w:p>
-        </w:tc>
-        <w:tc>
-          <w:tcPr>
-            <w:tcW w:type="dxa" w:w="2477"/>
-            <w:vAlign w:val="center"/>
-            <w:shd w:fill="F2F1F5"/>
-          </w:tcPr>
-          <w:p>
-            <w:pPr>
-              <w:spacing w:after="0"/>
-            </w:pPr>
-            <w:r/>
-            <w:r>
-              <w:rPr>
-                <w:rFonts w:ascii="Arial" w:hAnsi="Arial"/>
-                <w:b w:val="0"/>
-                <w:i/>
-                <w:color w:val="202028"/>
-                <w:sz w:val="14"/>
-              </w:rPr>
-              <w:t>Break / Transition</w:t>
-            </w:r>
-          </w:p>
-        </w:tc>
-        <w:tc>
-          <w:tcPr>
-            <w:tcW w:type="dxa" w:w="2088"/>
-            <w:vAlign w:val="center"/>
-            <w:shd w:fill="F2F1F5"/>
-          </w:tcPr>
-          <w:p>
-            <w:pPr>
-              <w:spacing w:after="0"/>
-            </w:pPr>
-            <w:r/>
-            <w:r>
-              <w:rPr>
-                <w:rFonts w:ascii="Arial" w:hAnsi="Arial"/>
-                <w:b w:val="0"/>
-                <w:i w:val="0"/>
-                <w:color w:val="202028"/>
-                <w:sz w:val="14"/>
-              </w:rPr>
-              <w:t>Block I</w:t>
-            </w:r>
-          </w:p>
-        </w:tc>
-        <w:tc>
-          <w:tcPr>
-            <w:tcW w:type="dxa" w:w="1008"/>
-            <w:vAlign w:val="center"/>
-            <w:shd w:fill="F2F1F5"/>
-          </w:tcPr>
-          <w:p>
-            <w:pPr>
-              <w:spacing w:after="0"/>
-            </w:pPr>
-            <w:r/>
-            <w:r>
-              <w:rPr>
-                <w:rFonts w:ascii="Arial" w:hAnsi="Arial"/>
-                <w:b w:val="0"/>
-                <w:i w:val="0"/>
-                <w:color w:val="202028"/>
-                <w:sz w:val="14"/>
-              </w:rPr>
-              <w:t>5:48 PM</w:t>
-            </w:r>
-          </w:p>
-        </w:tc>
-        <w:tc>
-          <w:tcPr>
-            <w:tcW w:type="dxa" w:w="1008"/>
-            <w:vAlign w:val="center"/>
-            <w:shd w:fill="F2F1F5"/>
-          </w:tcPr>
-          <w:p>
-            <w:pPr>
-              <w:spacing w:after="0"/>
-            </w:pPr>
-            <w:r/>
-            <w:r>
-              <w:rPr>
-                <w:rFonts w:ascii="Arial" w:hAnsi="Arial"/>
-                <w:b w:val="0"/>
-                <w:i w:val="0"/>
-                <w:color w:val="202028"/>
-                <w:sz w:val="14"/>
-              </w:rPr>
-              <w:t>5:49 PM</w:t>
             </w:r>
           </w:p>
         </w:tc>

</xml_diff>

<commit_message>
Shift final run of show segments earlier
</commit_message>
<xml_diff>
--- a/public/SIX-2026-Run-of-Show.docx
+++ b/public/SIX-2026-Run-of-Show.docx
@@ -14022,7 +14022,7 @@
                 <w:color w:val="202028"/>
                 <w:sz w:val="14"/>
               </w:rPr>
-              <w:t>5:49 PM</w:t>
+              <w:t>5:42 PM</w:t>
             </w:r>
           </w:p>
         </w:tc>
@@ -14161,7 +14161,7 @@
                 <w:color w:val="202028"/>
                 <w:sz w:val="14"/>
               </w:rPr>
-              <w:t>5:49 PM</w:t>
+              <w:t>5:42 PM</w:t>
             </w:r>
           </w:p>
         </w:tc>
@@ -14184,7 +14184,7 @@
                 <w:color w:val="202028"/>
                 <w:sz w:val="14"/>
               </w:rPr>
-              <w:t>5:54 PM</w:t>
+              <w:t>5:47 PM</w:t>
             </w:r>
           </w:p>
         </w:tc>
@@ -14323,7 +14323,7 @@
                 <w:color w:val="202028"/>
                 <w:sz w:val="14"/>
               </w:rPr>
-              <w:t>5:54 PM</w:t>
+              <w:t>5:47 PM</w:t>
             </w:r>
           </w:p>
         </w:tc>
@@ -14346,7 +14346,7 @@
                 <w:color w:val="202028"/>
                 <w:sz w:val="14"/>
               </w:rPr>
-              <w:t>5:55 PM</w:t>
+              <w:t>5:48 PM</w:t>
             </w:r>
           </w:p>
         </w:tc>
@@ -14485,7 +14485,7 @@
                 <w:color w:val="202028"/>
                 <w:sz w:val="14"/>
               </w:rPr>
-              <w:t>5:55 PM</w:t>
+              <w:t>5:48 PM</w:t>
             </w:r>
           </w:p>
         </w:tc>
@@ -14508,7 +14508,7 @@
                 <w:color w:val="202028"/>
                 <w:sz w:val="14"/>
               </w:rPr>
-              <w:t>6:05 PM</w:t>
+              <w:t>5:58 PM</w:t>
             </w:r>
           </w:p>
         </w:tc>

</xml_diff>